<commit_message>
Resumen revisado; artículo en español reconstruido tras la auditoría (Tabla 9, PNOEC con página, nombre del IPMN)
Co-Authored-By: Claude Opus 5.5 <noreply@anthropic.com>
</commit_message>
<xml_diff>
--- a/docs/Articulo_Poder_Maritimo_y_Ciberpoder.docx
+++ b/docs/Articulo_Poder_Maritimo_y_Ciberpoder.docx
@@ -73,7 +73,7 @@
         <w:rPr>
           <w:lang w:val="es-CO"/>
         </w:rPr>
-        <w:t xml:space="preserve">La formulación clásica del poder marítimo —el producto de los intereses marítimos y el poder naval— resulta insuficiente para explicar las dinámicas de los entornos marítimos digitalizados. Este artículo propone una formulación ampliada que incorpora el ciberpoder, la voluntad estratégica y la seguridad marítima como variables estructurales, con una estructura multiplicativa normalizada en la que el colapso de cualquier dimensión restringe el agregado y cuyo resultado se interpreta en una escala de cinco niveles. La formulación se verifica en sus propiedades matemáticas, su sensibilidad y su robustez ante la incertidumbre; la calibración y la validación externa se distinguen de la verificación y se dejan como agenda. Colombia se emplea como caso ilustrativo: el modelo la sitúa en el nivel moderado y muestra qué componentes concentran las mayores brechas. Se concluye proponiendo un índice nacional de poder marítimo, acompañado de un simulador interactivo de acceso abierto.</w:t>
+        <w:t xml:space="preserve">La formulación clásica del poder marítimo —el producto de los intereses marítimos y el poder naval— resulta insuficiente para explicar las dinámicas de los entornos marítimos digitalizados, cuyas funciones de navegación, comunicaciones, puertos y vigilancia dependen de infraestructuras digitales interconectadas. A partir de una teoría del poder en la que el poder naval es la expresión del poder militar en el mar y el poder marítimo lo combina con intereses económicos, sociales y políticos, el artículo sostiene que el ciberpoder atraviesa ambos componentes y que, a diferencia del poder naval, no decae con la distancia. Propone una formulación ampliada que incorpora el ciberpoder, la voluntad estratégica y la seguridad marítima como variables estructurales, con una estructura multiplicativa normalizada en la que el colapso de cualquier dimensión restringe el agregado y cuyo resultado se interpreta en una escala de cinco niveles. La formulación se verifica en sus propiedades matemáticas, su sensibilidad y su robustez ante la incertidumbre; la calibración y la validación externa se distinguen de la verificación y se dejan como agenda. Colombia se emplea como caso ilustrativo: el modelo la sitúa en el nivel Moderado y muestra qué componentes concentran las mayores brechas, mientras que su política oceánica nacional, que enmarca los planes de desarrollo, no contempla la dimensión cibernética. Se concluye proponiendo un Índice de Poder Marítimo Nacional, acompañado de un simulador interactivo de acceso abierto.</w:t>
       </w:r>
     </w:p>
     <w:p>
@@ -670,7 +670,7 @@
           <w:szCs w:val="22"/>
           <w:lang w:val="es-CO"/>
         </w:rPr>
-        <w:t xml:space="preserve">Fuente: Uribe Cáceres (2021)</w:t>
+        <w:t xml:space="preserve">Fuente: Uribe Cáceres (2021).</w:t>
       </w:r>
     </w:p>
     <w:p>
@@ -897,7 +897,7 @@
         <w:rPr>
           <w:lang w:val="es-CO"/>
         </w:rPr>
-        <w:t xml:space="preserve"> una búsqueda exploratoria inicial en Scopus, Web of Science, Google Académico y repositorios de escuelas navales regionales no quedó registrada de forma reproducible, por lo que para esta versión se repitió como búsqueda documentada. El 13 de octubre de 2026 se ejecutaron cuatro consultas por título y resumen en OpenAlex y Scopus para el periodo 2014–2026, en inglés y en español: (C1) poder marítimo, naval o </w:t>
+        <w:t xml:space="preserve"> una búsqueda exploratoria inicial en Scopus, Web of Science, Google Académico y repositorios de escuelas navales regionales no quedó registrada de forma reproducible, por lo que se repitió como búsqueda documentada. El 13 de octubre de 2026 se ejecutaron cuatro consultas por título y resumen en OpenAlex y Scopus para el periodo 2014–2026, en inglés y en español: (C1) poder marítimo, naval o </w:t>
       </w:r>
       <w:r>
         <w:rPr>
@@ -2715,7 +2715,7 @@
           <w:szCs w:val="22"/>
           <w:lang w:val="es-CO"/>
         </w:rPr>
-        <w:t xml:space="preserve">Fuente: elaboración propia</w:t>
+        <w:t xml:space="preserve">Fuente: elaboración propia.</w:t>
       </w:r>
     </w:p>
     <w:p>
@@ -6082,7 +6082,7 @@
           <w:szCs w:val="22"/>
           <w:lang w:val="es-CO"/>
         </w:rPr>
-        <w:t xml:space="preserve">Fuente: elaboración propia</w:t>
+        <w:t xml:space="preserve">Fuente: elaboración propia.</w:t>
       </w:r>
     </w:p>
     <w:p>
@@ -10318,7 +10318,7 @@
           <w:szCs w:val="22"/>
           <w:lang w:val="es-CO"/>
         </w:rPr>
-        <w:t xml:space="preserve">Fuente: elaboración propia</w:t>
+        <w:t xml:space="preserve">Fuente: elaboración propia.</w:t>
       </w:r>
     </w:p>
     <w:p>
@@ -10461,7 +10461,7 @@
         <w:rPr>
           <w:lang w:val="es-CO"/>
         </w:rPr>
-        <w:t xml:space="preserve"> La Voluntad Estratégica presenta, finalmente, una dimensión cualitativa que complementa los resultados anteriores. El Plan de Desarrollo Naval 2042 (ARC, 2022) evidencia avances en la definición de objetivos estratégicos y en la institucionalización del interés marítimo, correspondientes a una voluntad política e institucional sólida; la principal brecha se sitúa en la voluntad social —la conciencia marítima traducida en apropiación nacional efectiva—, que la propia literatura identifica como un reto histórico para Colombia como nación marítima.</w:t>
+        <w:t xml:space="preserve"> La Voluntad Estratégica presenta, finalmente, una dimensión cualitativa que complementa los resultados anteriores. El Plan de Desarrollo Naval 2042 (ARC, 2022) evidencia avances en la definición de objetivos estratégicos y en la institucionalización del interés marítimo, correspondientes a una voluntad política e institucional sólida; la principal brecha se sitúa en la voluntad social —la conciencia marítima traducida en apropiación nacional efectiva—, cuyas debilidades reconoce la propia política oceánica nacional (CCO, 2018, pp. 46–47).</w:t>
       </w:r>
     </w:p>
     <w:p>
@@ -20029,6 +20029,44 @@
                 <w:bCs/>
                 <w:lang w:val="es-CO"/>
               </w:rPr>
+              <w:t xml:space="preserve">CDb</w:t>
+            </w:r>
+          </w:p>
+        </w:tc>
+        <w:tc>
+          <w:tcPr>
+            <w:tcW w:w="7300" w:type="dxa"/>
+            <w:vAlign w:val="center"/>
+          </w:tcPr>
+          <w:p>
+            <w:pPr>
+              <w:spacing w:after="20"/>
+            </w:pPr>
+            <w:r>
+              <w:rPr>
+                <w:lang w:val="es-CO"/>
+              </w:rPr>
+              <w:t xml:space="preserve">Ciberdiplomacia</w:t>
+            </w:r>
+          </w:p>
+        </w:tc>
+      </w:tr>
+      <w:tr>
+        <w:tc>
+          <w:tcPr>
+            <w:tcW w:w="2059" w:type="dxa"/>
+            <w:vAlign w:val="center"/>
+          </w:tcPr>
+          <w:p>
+            <w:pPr>
+              <w:spacing w:after="20"/>
+            </w:pPr>
+            <w:r>
+              <w:rPr>
+                <w:b/>
+                <w:bCs/>
+                <w:lang w:val="es-CO"/>
+              </w:rPr>
               <w:t xml:space="preserve">CD</w:t>
             </w:r>
             <w:r>
@@ -20076,7 +20114,7 @@
                 <w:bCs/>
                 <w:lang w:val="es-CO"/>
               </w:rPr>
-              <w:t xml:space="preserve">CDb</w:t>
+              <w:t xml:space="preserve">CI</w:t>
             </w:r>
           </w:p>
         </w:tc>
@@ -20093,121 +20131,7 @@
               <w:rPr>
                 <w:lang w:val="es-CO"/>
               </w:rPr>
-              <w:t xml:space="preserve">Ciberdiplomacia</w:t>
-            </w:r>
-          </w:p>
-        </w:tc>
-      </w:tr>
-      <w:tr>
-        <w:tc>
-          <w:tcPr>
-            <w:tcW w:w="2059" w:type="dxa"/>
-            <w:vAlign w:val="center"/>
-          </w:tcPr>
-          <w:p>
-            <w:pPr>
-              <w:spacing w:after="20"/>
-            </w:pPr>
-            <w:r>
-              <w:rPr>
-                <w:b/>
-                <w:bCs/>
-                <w:lang w:val="es-CO"/>
-              </w:rPr>
-              <w:t xml:space="preserve">CI</w:t>
-            </w:r>
-          </w:p>
-        </w:tc>
-        <w:tc>
-          <w:tcPr>
-            <w:tcW w:w="7300" w:type="dxa"/>
-            <w:vAlign w:val="center"/>
-          </w:tcPr>
-          <w:p>
-            <w:pPr>
-              <w:spacing w:after="20"/>
-            </w:pPr>
-            <w:r>
-              <w:rPr>
-                <w:lang w:val="es-CO"/>
-              </w:rPr>
               <w:t xml:space="preserve">Conflictos interestatales</w:t>
-            </w:r>
-          </w:p>
-        </w:tc>
-      </w:tr>
-      <w:tr>
-        <w:tc>
-          <w:tcPr>
-            <w:tcW w:w="2059" w:type="dxa"/>
-            <w:vAlign w:val="center"/>
-          </w:tcPr>
-          <w:p>
-            <w:pPr>
-              <w:spacing w:after="20"/>
-            </w:pPr>
-            <w:r>
-              <w:rPr>
-                <w:b/>
-                <w:bCs/>
-                <w:lang w:val="es-CO"/>
-              </w:rPr>
-              <w:t xml:space="preserve">CIBSI</w:t>
-            </w:r>
-          </w:p>
-        </w:tc>
-        <w:tc>
-          <w:tcPr>
-            <w:tcW w:w="7300" w:type="dxa"/>
-            <w:vAlign w:val="center"/>
-          </w:tcPr>
-          <w:p>
-            <w:pPr>
-              <w:spacing w:after="20"/>
-            </w:pPr>
-            <w:r>
-              <w:rPr>
-                <w:lang w:val="es-CO"/>
-              </w:rPr>
-              <w:t xml:space="preserve">Congreso Iberoamericano de Seguridad Informática</w:t>
-            </w:r>
-          </w:p>
-        </w:tc>
-      </w:tr>
-      <w:tr>
-        <w:tc>
-          <w:tcPr>
-            <w:tcW w:w="2059" w:type="dxa"/>
-            <w:vAlign w:val="center"/>
-          </w:tcPr>
-          <w:p>
-            <w:pPr>
-              <w:spacing w:after="20"/>
-            </w:pPr>
-            <w:r>
-              <w:rPr>
-                <w:b/>
-                <w:bCs/>
-                <w:lang w:val="es-CO"/>
-              </w:rPr>
-              <w:t xml:space="preserve">CONPES</w:t>
-            </w:r>
-          </w:p>
-        </w:tc>
-        <w:tc>
-          <w:tcPr>
-            <w:tcW w:w="7300" w:type="dxa"/>
-            <w:vAlign w:val="center"/>
-          </w:tcPr>
-          <w:p>
-            <w:pPr>
-              <w:spacing w:after="20"/>
-            </w:pPr>
-            <w:r>
-              <w:rPr>
-                <w:lang w:val="es-CO"/>
-              </w:rPr>
-              <w:t xml:space="preserve">Consejo Nacional de Política Económica y Social</w:t>
             </w:r>
           </w:p>
         </w:tc>
@@ -20436,7 +20360,7 @@
                 <w:bCs/>
                 <w:lang w:val="es-CO"/>
               </w:rPr>
-              <w:t xml:space="preserve">GMDSS</w:t>
+              <w:t xml:space="preserve">F</w:t>
             </w:r>
           </w:p>
         </w:tc>
@@ -20453,7 +20377,7 @@
               <w:rPr>
                 <w:lang w:val="es-CO"/>
               </w:rPr>
-              <w:t xml:space="preserve">Global Maritime Distress and Safety System (Sistema Mundial de Socorro y Seguridad Marítima)</w:t>
+              <w:t xml:space="preserve">Fuerza (factor del PN)</w:t>
             </w:r>
           </w:p>
         </w:tc>
@@ -20474,7 +20398,7 @@
                 <w:bCs/>
                 <w:lang w:val="es-CO"/>
               </w:rPr>
-              <w:t xml:space="preserve">IGS</w:t>
+              <w:t xml:space="preserve">GMDSS</w:t>
             </w:r>
           </w:p>
         </w:tc>
@@ -20491,7 +20415,7 @@
               <w:rPr>
                 <w:lang w:val="es-CO"/>
               </w:rPr>
-              <w:t xml:space="preserve">Código Internacional de Gestión de la Seguridad (ISM Code)</w:t>
+              <w:t xml:space="preserve">Global Maritime Distress and Safety System (Sistema Mundial de Socorro y Seguridad Marítima)</w:t>
             </w:r>
           </w:p>
         </w:tc>
@@ -20512,7 +20436,7 @@
                 <w:bCs/>
                 <w:lang w:val="es-CO"/>
               </w:rPr>
-              <w:t xml:space="preserve">IISS</w:t>
+              <w:t xml:space="preserve">IGS</w:t>
             </w:r>
           </w:p>
         </w:tc>
@@ -20529,7 +20453,7 @@
               <w:rPr>
                 <w:lang w:val="es-CO"/>
               </w:rPr>
-              <w:t xml:space="preserve">International Institute for Strategic Studies</w:t>
+              <w:t xml:space="preserve">Código Internacional de Gestión de la Seguridad (ISM Code)</w:t>
             </w:r>
           </w:p>
         </w:tc>
@@ -20550,7 +20474,7 @@
                 <w:bCs/>
                 <w:lang w:val="es-CO"/>
               </w:rPr>
-              <w:t xml:space="preserve">IM</w:t>
+              <w:t xml:space="preserve">IISS</w:t>
             </w:r>
           </w:p>
         </w:tc>
@@ -20567,7 +20491,7 @@
               <w:rPr>
                 <w:lang w:val="es-CO"/>
               </w:rPr>
-              <w:t xml:space="preserve">Intereses marítimos</w:t>
+              <w:t xml:space="preserve">International Institute for Strategic Studies</w:t>
             </w:r>
           </w:p>
         </w:tc>
@@ -20588,7 +20512,7 @@
                 <w:bCs/>
                 <w:lang w:val="es-CO"/>
               </w:rPr>
-              <w:t xml:space="preserve">IMEMO</w:t>
+              <w:t xml:space="preserve">IM</w:t>
             </w:r>
           </w:p>
         </w:tc>
@@ -20605,7 +20529,7 @@
               <w:rPr>
                 <w:lang w:val="es-CO"/>
               </w:rPr>
-              <w:t xml:space="preserve">Instituto Primakov de Economía Mundial y Relaciones Internacionales</w:t>
+              <w:t xml:space="preserve">Intereses marítimos</w:t>
             </w:r>
           </w:p>
         </w:tc>
@@ -20626,7 +20550,7 @@
                 <w:bCs/>
                 <w:lang w:val="es-CO"/>
               </w:rPr>
-              <w:t xml:space="preserve">INDNR</w:t>
+              <w:t xml:space="preserve">IMEMO</w:t>
             </w:r>
           </w:p>
         </w:tc>
@@ -20643,7 +20567,7 @@
               <w:rPr>
                 <w:lang w:val="es-CO"/>
               </w:rPr>
-              <w:t xml:space="preserve">Pesca ilegal, no declarada y no reglamentada</w:t>
+              <w:t xml:space="preserve">Instituto Primakov de Economía Mundial y Relaciones Internacionales</w:t>
             </w:r>
           </w:p>
         </w:tc>
@@ -20664,7 +20588,7 @@
                 <w:bCs/>
                 <w:lang w:val="es-CO"/>
               </w:rPr>
-              <w:t xml:space="preserve">IPMN</w:t>
+              <w:t xml:space="preserve">INDNR</w:t>
             </w:r>
           </w:p>
         </w:tc>
@@ -20681,7 +20605,7 @@
               <w:rPr>
                 <w:lang w:val="es-CO"/>
               </w:rPr>
-              <w:t xml:space="preserve">Índice de Poder Marítimo Nacional</w:t>
+              <w:t xml:space="preserve">Pesca ilegal, no declarada y no reglamentada</w:t>
             </w:r>
           </w:p>
         </w:tc>
@@ -20702,7 +20626,7 @@
                 <w:bCs/>
                 <w:lang w:val="es-CO"/>
               </w:rPr>
-              <w:t xml:space="preserve">ISPS</w:t>
+              <w:t xml:space="preserve">IPMN</w:t>
             </w:r>
           </w:p>
         </w:tc>
@@ -20719,7 +20643,7 @@
               <w:rPr>
                 <w:lang w:val="es-CO"/>
               </w:rPr>
-              <w:t xml:space="preserve">International Ship and Port Facility Security Code (Código Internacional para la Protección de los Buques y de las Instalaciones Portuarias)</w:t>
+              <w:t xml:space="preserve">Índice de Poder Marítimo Nacional</w:t>
             </w:r>
           </w:p>
         </w:tc>
@@ -20740,7 +20664,7 @@
                 <w:bCs/>
                 <w:lang w:val="es-CO"/>
               </w:rPr>
-              <w:t xml:space="preserve">IT/OT</w:t>
+              <w:t xml:space="preserve">ISPS</w:t>
             </w:r>
           </w:p>
         </w:tc>
@@ -20757,7 +20681,7 @@
               <w:rPr>
                 <w:lang w:val="es-CO"/>
               </w:rPr>
-              <w:t xml:space="preserve">Information Technology / Operational Technology (tecnologías de la información / tecnología operacional)</w:t>
+              <w:t xml:space="preserve">International Ship and Port Facility Security Code (Código Internacional para la Protección de los Buques y de las Instalaciones Portuarias)</w:t>
             </w:r>
           </w:p>
         </w:tc>
@@ -20778,7 +20702,7 @@
                 <w:bCs/>
                 <w:lang w:val="es-CO"/>
               </w:rPr>
-              <w:t xml:space="preserve">MARCIM</w:t>
+              <w:t xml:space="preserve">IT/OT</w:t>
             </w:r>
           </w:p>
         </w:tc>
@@ -20795,7 +20719,7 @@
               <w:rPr>
                 <w:lang w:val="es-CO"/>
               </w:rPr>
-              <w:t xml:space="preserve">Marco de Referencia para el Modelamiento y Simulación de la Ciberdefensa Marítima</w:t>
+              <w:t xml:space="preserve">Information Technology / Operational Technology (tecnologías de la información / tecnología operacional)</w:t>
             </w:r>
           </w:p>
         </w:tc>
@@ -20816,7 +20740,7 @@
                 <w:bCs/>
                 <w:lang w:val="es-CO"/>
               </w:rPr>
-              <w:t xml:space="preserve">MDA</w:t>
+              <w:t xml:space="preserve">MARCIM</w:t>
             </w:r>
           </w:p>
         </w:tc>
@@ -20833,7 +20757,7 @@
               <w:rPr>
                 <w:lang w:val="es-CO"/>
               </w:rPr>
-              <w:t xml:space="preserve">Maritime Domain Awareness (conciencia del dominio marítimo)</w:t>
+              <w:t xml:space="preserve">Marco de Referencia para el Modelamiento y Simulación de la Ciberdefensa Marítima</w:t>
             </w:r>
           </w:p>
         </w:tc>
@@ -20854,7 +20778,7 @@
                 <w:bCs/>
                 <w:lang w:val="es-CO"/>
               </w:rPr>
-              <w:t xml:space="preserve">MSC</w:t>
+              <w:t xml:space="preserve">MDA</w:t>
             </w:r>
           </w:p>
         </w:tc>
@@ -20871,7 +20795,7 @@
               <w:rPr>
                 <w:lang w:val="es-CO"/>
               </w:rPr>
-              <w:t xml:space="preserve">Maritime Safety Committee (Comité de Seguridad Marítima de la OMI)</w:t>
+              <w:t xml:space="preserve">Maritime Domain Awareness (conciencia del dominio marítimo)</w:t>
             </w:r>
           </w:p>
         </w:tc>
@@ -20892,7 +20816,7 @@
                 <w:bCs/>
                 <w:lang w:val="es-CO"/>
               </w:rPr>
-              <w:t xml:space="preserve">OCDE</w:t>
+              <w:t xml:space="preserve">MSC</w:t>
             </w:r>
           </w:p>
         </w:tc>
@@ -20909,7 +20833,7 @@
               <w:rPr>
                 <w:lang w:val="es-CO"/>
               </w:rPr>
-              <w:t xml:space="preserve">Organización para la Cooperación y el Desarrollo Económicos</w:t>
+              <w:t xml:space="preserve">Maritime Safety Committee (Comité de Seguridad Marítima de la OMI)</w:t>
             </w:r>
           </w:p>
         </w:tc>
@@ -20930,7 +20854,7 @@
                 <w:bCs/>
                 <w:lang w:val="es-CO"/>
               </w:rPr>
-              <w:t xml:space="preserve">OEWG</w:t>
+              <w:t xml:space="preserve">OCDE</w:t>
             </w:r>
           </w:p>
         </w:tc>
@@ -20947,7 +20871,7 @@
               <w:rPr>
                 <w:lang w:val="es-CO"/>
               </w:rPr>
-              <w:t xml:space="preserve">Open-Ended Working Group (Grupo de Trabajo de Composición Abierta de la ONU)</w:t>
+              <w:t xml:space="preserve">Organización para la Cooperación y el Desarrollo Económicos</w:t>
             </w:r>
           </w:p>
         </w:tc>
@@ -20968,7 +20892,7 @@
                 <w:bCs/>
                 <w:lang w:val="es-CO"/>
               </w:rPr>
-              <w:t xml:space="preserve">OMI</w:t>
+              <w:t xml:space="preserve">OEWG</w:t>
             </w:r>
           </w:p>
         </w:tc>
@@ -20985,7 +20909,7 @@
               <w:rPr>
                 <w:lang w:val="es-CO"/>
               </w:rPr>
-              <w:t xml:space="preserve">Organización Marítima Internacional</w:t>
+              <w:t xml:space="preserve">Open-Ended Working Group (Grupo de Trabajo de Composición Abierta de la ONU)</w:t>
             </w:r>
           </w:p>
         </w:tc>
@@ -21006,7 +20930,7 @@
                 <w:bCs/>
                 <w:lang w:val="es-CO"/>
               </w:rPr>
-              <w:t xml:space="preserve">ONU</w:t>
+              <w:t xml:space="preserve">OMI</w:t>
             </w:r>
           </w:p>
         </w:tc>
@@ -21023,7 +20947,7 @@
               <w:rPr>
                 <w:lang w:val="es-CO"/>
               </w:rPr>
-              <w:t xml:space="preserve">Organización de las Naciones Unidas</w:t>
+              <w:t xml:space="preserve">Organización Marítima Internacional</w:t>
             </w:r>
           </w:p>
         </w:tc>
@@ -21044,7 +20968,7 @@
                 <w:bCs/>
                 <w:lang w:val="es-CO"/>
               </w:rPr>
-              <w:t xml:space="preserve">OTAN</w:t>
+              <w:t xml:space="preserve">ONU</w:t>
             </w:r>
           </w:p>
         </w:tc>
@@ -21061,7 +20985,7 @@
               <w:rPr>
                 <w:lang w:val="es-CO"/>
               </w:rPr>
-              <w:t xml:space="preserve">Organización del Tratado del Atlántico Norte</w:t>
+              <w:t xml:space="preserve">Organización de las Naciones Unidas</w:t>
             </w:r>
           </w:p>
         </w:tc>
@@ -21082,7 +21006,7 @@
                 <w:bCs/>
                 <w:lang w:val="es-CO"/>
               </w:rPr>
-              <w:t xml:space="preserve">PDN</w:t>
+              <w:t xml:space="preserve">OTAN</w:t>
             </w:r>
           </w:p>
         </w:tc>
@@ -21099,7 +21023,7 @@
               <w:rPr>
                 <w:lang w:val="es-CO"/>
               </w:rPr>
-              <w:t xml:space="preserve">Plan de Desarrollo Naval</w:t>
+              <w:t xml:space="preserve">Organización del Tratado del Atlántico Norte</w:t>
             </w:r>
           </w:p>
         </w:tc>
@@ -21120,7 +21044,7 @@
                 <w:bCs/>
                 <w:lang w:val="es-CO"/>
               </w:rPr>
-              <w:t xml:space="preserve">PM</w:t>
+              <w:t xml:space="preserve">P</w:t>
             </w:r>
           </w:p>
         </w:tc>
@@ -21137,7 +21061,7 @@
               <w:rPr>
                 <w:lang w:val="es-CO"/>
               </w:rPr>
-              <w:t xml:space="preserve">Poder marítimo</w:t>
+              <w:t xml:space="preserve">Posición (factor del PN)</w:t>
             </w:r>
           </w:p>
         </w:tc>
@@ -21158,7 +21082,7 @@
                 <w:bCs/>
                 <w:lang w:val="es-CO"/>
               </w:rPr>
-              <w:t xml:space="preserve">PN</w:t>
+              <w:t xml:space="preserve">PDN</w:t>
             </w:r>
           </w:p>
         </w:tc>
@@ -21175,7 +21099,7 @@
               <w:rPr>
                 <w:lang w:val="es-CO"/>
               </w:rPr>
-              <w:t xml:space="preserve">Poder naval</w:t>
+              <w:t xml:space="preserve">Plan de Desarrollo Naval</w:t>
             </w:r>
           </w:p>
         </w:tc>
@@ -21196,7 +21120,7 @@
                 <w:bCs/>
                 <w:lang w:val="es-CO"/>
               </w:rPr>
-              <w:t xml:space="preserve">PNOEC</w:t>
+              <w:t xml:space="preserve">PM</w:t>
             </w:r>
           </w:p>
         </w:tc>
@@ -21213,7 +21137,7 @@
               <w:rPr>
                 <w:lang w:val="es-CO"/>
               </w:rPr>
-              <w:t xml:space="preserve">Política Nacional del Océano y de los Espacios Costeros</w:t>
+              <w:t xml:space="preserve">Poder marítimo</w:t>
             </w:r>
           </w:p>
         </w:tc>
@@ -21234,7 +21158,7 @@
                 <w:bCs/>
                 <w:lang w:val="es-CO"/>
               </w:rPr>
-              <w:t xml:space="preserve">PNUD</w:t>
+              <w:t xml:space="preserve">PN</w:t>
             </w:r>
           </w:p>
         </w:tc>
@@ -21251,7 +21175,7 @@
               <w:rPr>
                 <w:lang w:val="es-CO"/>
               </w:rPr>
-              <w:t xml:space="preserve">Programa de las Naciones Unidas para el Desarrollo</w:t>
+              <w:t xml:space="preserve">Poder naval</w:t>
             </w:r>
           </w:p>
         </w:tc>
@@ -21272,7 +21196,7 @@
                 <w:bCs/>
                 <w:lang w:val="es-CO"/>
               </w:rPr>
-              <w:t xml:space="preserve">SERDUX-MARCIM</w:t>
+              <w:t xml:space="preserve">PNOEC</w:t>
             </w:r>
           </w:p>
         </w:tc>
@@ -21289,7 +21213,7 @@
               <w:rPr>
                 <w:lang w:val="es-CO"/>
               </w:rPr>
-              <w:t xml:space="preserve">Modelo de simulación de ciberataques marítimos de MARCIM</w:t>
+              <w:t xml:space="preserve">Política Nacional del Océano y de los Espacios Costeros</w:t>
             </w:r>
           </w:p>
         </w:tc>
@@ -21310,7 +21234,7 @@
                 <w:bCs/>
                 <w:lang w:val="es-CO"/>
               </w:rPr>
-              <w:t xml:space="preserve">SM</w:t>
+              <w:t xml:space="preserve">PNUD</w:t>
             </w:r>
           </w:p>
         </w:tc>
@@ -21327,7 +21251,7 @@
               <w:rPr>
                 <w:lang w:val="es-CO"/>
               </w:rPr>
-              <w:t xml:space="preserve">Seguridad marítima</w:t>
+              <w:t xml:space="preserve">Programa de las Naciones Unidas para el Desarrollo</w:t>
             </w:r>
           </w:p>
         </w:tc>
@@ -21348,7 +21272,7 @@
                 <w:bCs/>
                 <w:lang w:val="es-CO"/>
               </w:rPr>
-              <w:t xml:space="preserve">SOLAS</w:t>
+              <w:t xml:space="preserve">ReCAAP</w:t>
             </w:r>
           </w:p>
         </w:tc>
@@ -21365,7 +21289,7 @@
               <w:rPr>
                 <w:lang w:val="es-CO"/>
               </w:rPr>
-              <w:t xml:space="preserve">Convenio Internacional para la Seguridad de la Vida Humana en el Mar</w:t>
+              <w:t xml:space="preserve">Regional Cooperation Agreement on Combating Piracy and Armed Robbery against Ships in Asia (Acuerdo de Cooperación Regional para Combatir la Piratería y el Robo a Mano Armada contra Buques en Asia)</w:t>
             </w:r>
           </w:p>
         </w:tc>
@@ -21386,7 +21310,7 @@
                 <w:bCs/>
                 <w:lang w:val="es-CO"/>
               </w:rPr>
-              <w:t xml:space="preserve">SUA</w:t>
+              <w:t xml:space="preserve">SERDUX-MARCIM</w:t>
             </w:r>
           </w:p>
         </w:tc>
@@ -21403,7 +21327,7 @@
               <w:rPr>
                 <w:lang w:val="es-CO"/>
               </w:rPr>
-              <w:t xml:space="preserve">Convention for the Suppression of Unlawful Acts against the Safety of Maritime Navigation (Convenio para la Represión de Actos Ilícitos contra la Seguridad de la Navegación Marítima)</w:t>
+              <w:t xml:space="preserve">Modelo de simulación de ciberataques marítimos de MARCIM</w:t>
             </w:r>
           </w:p>
         </w:tc>
@@ -21424,7 +21348,7 @@
                 <w:bCs/>
                 <w:lang w:val="es-CO"/>
               </w:rPr>
-              <w:t xml:space="preserve">TE</w:t>
+              <w:t xml:space="preserve">SM</w:t>
             </w:r>
           </w:p>
         </w:tc>
@@ -21441,7 +21365,7 @@
               <w:rPr>
                 <w:lang w:val="es-CO"/>
               </w:rPr>
-              <w:t xml:space="preserve">Terrorismo y extremismo</w:t>
+              <w:t xml:space="preserve">Seguridad marítima</w:t>
             </w:r>
           </w:p>
         </w:tc>
@@ -21462,7 +21386,7 @@
                 <w:bCs/>
                 <w:lang w:val="es-CO"/>
               </w:rPr>
-              <w:t xml:space="preserve">UIT</w:t>
+              <w:t xml:space="preserve">SOLAS</w:t>
             </w:r>
           </w:p>
         </w:tc>
@@ -21479,7 +21403,7 @@
               <w:rPr>
                 <w:lang w:val="es-CO"/>
               </w:rPr>
-              <w:t xml:space="preserve">Unión Internacional de Telecomunicaciones</w:t>
+              <w:t xml:space="preserve">Convenio Internacional para la Seguridad de la Vida Humana en el Mar</w:t>
             </w:r>
           </w:p>
         </w:tc>
@@ -21500,7 +21424,7 @@
                 <w:bCs/>
                 <w:lang w:val="es-CO"/>
               </w:rPr>
-              <w:t xml:space="preserve">USCG</w:t>
+              <w:t xml:space="preserve">SUA</w:t>
             </w:r>
           </w:p>
         </w:tc>
@@ -21517,7 +21441,7 @@
               <w:rPr>
                 <w:lang w:val="es-CO"/>
               </w:rPr>
-              <w:t xml:space="preserve">United States Coast Guard (Guardia Costera de los Estados Unidos)</w:t>
+              <w:t xml:space="preserve">Convention for the Suppression of Unlawful Acts against the Safety of Maritime Navigation (Convenio para la Represión de Actos Ilícitos contra la Seguridad de la Navegación Marítima)</w:t>
             </w:r>
           </w:p>
         </w:tc>
@@ -21538,7 +21462,7 @@
                 <w:bCs/>
                 <w:lang w:val="es-CO"/>
               </w:rPr>
-              <w:t xml:space="preserve">VE</w:t>
+              <w:t xml:space="preserve">TE</w:t>
             </w:r>
           </w:p>
         </w:tc>
@@ -21555,7 +21479,7 @@
               <w:rPr>
                 <w:lang w:val="es-CO"/>
               </w:rPr>
-              <w:t xml:space="preserve">Voluntad estratégica</w:t>
+              <w:t xml:space="preserve">Terrorismo y extremismo</w:t>
             </w:r>
           </w:p>
         </w:tc>
@@ -21576,7 +21500,7 @@
                 <w:bCs/>
                 <w:lang w:val="es-CO"/>
               </w:rPr>
-              <w:t xml:space="preserve">VI</w:t>
+              <w:t xml:space="preserve">UIT</w:t>
             </w:r>
           </w:p>
         </w:tc>
@@ -21593,7 +21517,7 @@
               <w:rPr>
                 <w:lang w:val="es-CO"/>
               </w:rPr>
-              <w:t xml:space="preserve">Voluntad institucional</w:t>
+              <w:t xml:space="preserve">Unión Internacional de Telecomunicaciones</w:t>
             </w:r>
           </w:p>
         </w:tc>
@@ -21614,7 +21538,7 @@
                 <w:bCs/>
                 <w:lang w:val="es-CO"/>
               </w:rPr>
-              <w:t xml:space="preserve">VP</w:t>
+              <w:t xml:space="preserve">USCG</w:t>
             </w:r>
           </w:p>
         </w:tc>
@@ -21631,7 +21555,7 @@
               <w:rPr>
                 <w:lang w:val="es-CO"/>
               </w:rPr>
-              <w:t xml:space="preserve">Voluntad política</w:t>
+              <w:t xml:space="preserve">United States Coast Guard (Guardia Costera de los Estados Unidos)</w:t>
             </w:r>
           </w:p>
         </w:tc>
@@ -21652,7 +21576,7 @@
                 <w:bCs/>
                 <w:lang w:val="es-CO"/>
               </w:rPr>
-              <w:t xml:space="preserve">VS</w:t>
+              <w:t xml:space="preserve">VE</w:t>
             </w:r>
           </w:p>
         </w:tc>
@@ -21669,7 +21593,7 @@
               <w:rPr>
                 <w:lang w:val="es-CO"/>
               </w:rPr>
-              <w:t xml:space="preserve">Voluntad social</w:t>
+              <w:t xml:space="preserve">Voluntad estratégica</w:t>
             </w:r>
           </w:p>
         </w:tc>
@@ -21690,7 +21614,7 @@
                 <w:bCs/>
                 <w:lang w:val="es-CO"/>
               </w:rPr>
-              <w:t xml:space="preserve">α</w:t>
+              <w:t xml:space="preserve">VI</w:t>
             </w:r>
           </w:p>
         </w:tc>
@@ -21707,7 +21631,7 @@
               <w:rPr>
                 <w:lang w:val="es-CO"/>
               </w:rPr>
-              <w:t xml:space="preserve">Exponente del ciberpoder (peso de la dependencia cibernética)</w:t>
+              <w:t xml:space="preserve">Voluntad institucional</w:t>
             </w:r>
           </w:p>
         </w:tc>
@@ -21728,6 +21652,419 @@
                 <w:bCs/>
                 <w:lang w:val="es-CO"/>
               </w:rPr>
+              <w:t xml:space="preserve">VP</w:t>
+            </w:r>
+          </w:p>
+        </w:tc>
+        <w:tc>
+          <w:tcPr>
+            <w:tcW w:w="7300" w:type="dxa"/>
+            <w:vAlign w:val="center"/>
+          </w:tcPr>
+          <w:p>
+            <w:pPr>
+              <w:spacing w:after="20"/>
+            </w:pPr>
+            <w:r>
+              <w:rPr>
+                <w:lang w:val="es-CO"/>
+              </w:rPr>
+              <w:t xml:space="preserve">Voluntad política</w:t>
+            </w:r>
+          </w:p>
+        </w:tc>
+      </w:tr>
+      <w:tr>
+        <w:tc>
+          <w:tcPr>
+            <w:tcW w:w="2059" w:type="dxa"/>
+            <w:vAlign w:val="center"/>
+          </w:tcPr>
+          <w:p>
+            <w:pPr>
+              <w:spacing w:after="20"/>
+            </w:pPr>
+            <w:r>
+              <w:rPr>
+                <w:b/>
+                <w:bCs/>
+                <w:lang w:val="es-CO"/>
+              </w:rPr>
+              <w:t xml:space="preserve">VS</w:t>
+            </w:r>
+          </w:p>
+        </w:tc>
+        <w:tc>
+          <w:tcPr>
+            <w:tcW w:w="7300" w:type="dxa"/>
+            <w:vAlign w:val="center"/>
+          </w:tcPr>
+          <w:p>
+            <w:pPr>
+              <w:spacing w:after="20"/>
+            </w:pPr>
+            <w:r>
+              <w:rPr>
+                <w:lang w:val="es-CO"/>
+              </w:rPr>
+              <w:t xml:space="preserve">Voluntad social</w:t>
+            </w:r>
+          </w:p>
+        </w:tc>
+      </w:tr>
+      <w:tr>
+        <w:tc>
+          <w:tcPr>
+            <w:tcW w:w="2059" w:type="dxa"/>
+            <w:vAlign w:val="center"/>
+          </w:tcPr>
+          <w:p>
+            <w:pPr>
+              <w:spacing w:after="20"/>
+            </w:pPr>
+            <w:r>
+              <w:rPr>
+                <w:b/>
+                <w:bCs/>
+                <w:lang w:val="es-CO"/>
+              </w:rPr>
+              <w:t xml:space="preserve">G</w:t>
+            </w:r>
+          </w:p>
+        </w:tc>
+        <w:tc>
+          <w:tcPr>
+            <w:tcW w:w="7300" w:type="dxa"/>
+            <w:vAlign w:val="center"/>
+          </w:tcPr>
+          <w:p>
+            <w:pPr>
+              <w:spacing w:after="20"/>
+            </w:pPr>
+            <w:r>
+              <w:rPr>
+                <w:lang w:val="es-CO"/>
+              </w:rPr>
+              <w:t xml:space="preserve">Media geométrica ponderada de IM, PN, VE y SM (Proposición 1)</w:t>
+            </w:r>
+          </w:p>
+        </w:tc>
+      </w:tr>
+      <w:tr>
+        <w:tc>
+          <w:tcPr>
+            <w:tcW w:w="2059" w:type="dxa"/>
+            <w:vAlign w:val="center"/>
+          </w:tcPr>
+          <w:p>
+            <w:pPr>
+              <w:spacing w:after="20"/>
+            </w:pPr>
+            <w:r>
+              <w:rPr>
+                <w:b/>
+                <w:bCs/>
+                <w:lang w:val="es-CO"/>
+              </w:rPr>
+              <w:t xml:space="preserve">n</w:t>
+            </w:r>
+            <w:r>
+              <w:rPr>
+                <w:b/>
+                <w:bCs/>
+                <w:vertAlign w:val="subscript"/>
+                <w:lang w:val="es-CO"/>
+              </w:rPr>
+              <w:t xml:space="preserve">eff</w:t>
+            </w:r>
+          </w:p>
+        </w:tc>
+        <w:tc>
+          <w:tcPr>
+            <w:tcW w:w="7300" w:type="dxa"/>
+            <w:vAlign w:val="center"/>
+          </w:tcPr>
+          <w:p>
+            <w:pPr>
+              <w:spacing w:after="20"/>
+            </w:pPr>
+            <w:r>
+              <w:rPr>
+                <w:lang w:val="es-CO"/>
+              </w:rPr>
+              <w:t xml:space="preserve">Número efectivo de factores, 3 + γ + α</w:t>
+            </w:r>
+          </w:p>
+        </w:tc>
+      </w:tr>
+      <w:tr>
+        <w:tc>
+          <w:tcPr>
+            <w:tcW w:w="2059" w:type="dxa"/>
+            <w:vAlign w:val="center"/>
+          </w:tcPr>
+          <w:p>
+            <w:pPr>
+              <w:spacing w:after="20"/>
+            </w:pPr>
+            <w:r>
+              <w:rPr>
+                <w:b/>
+                <w:bCs/>
+                <w:lang w:val="es-CO"/>
+              </w:rPr>
+              <w:t xml:space="preserve">S</w:t>
+            </w:r>
+            <w:r>
+              <w:rPr>
+                <w:b/>
+                <w:bCs/>
+                <w:vertAlign w:val="subscript"/>
+                <w:lang w:val="es-CO"/>
+              </w:rPr>
+              <w:t xml:space="preserve">i</w:t>
+            </w:r>
+            <w:r>
+              <w:rPr>
+                <w:b/>
+                <w:bCs/>
+                <w:lang w:val="es-CO"/>
+              </w:rPr>
+              <w:t xml:space="preserve">, S</w:t>
+            </w:r>
+            <w:r>
+              <w:rPr>
+                <w:b/>
+                <w:bCs/>
+                <w:vertAlign w:val="subscript"/>
+                <w:lang w:val="es-CO"/>
+              </w:rPr>
+              <w:t xml:space="preserve">Ti</w:t>
+            </w:r>
+          </w:p>
+        </w:tc>
+        <w:tc>
+          <w:tcPr>
+            <w:tcW w:w="7300" w:type="dxa"/>
+            <w:vAlign w:val="center"/>
+          </w:tcPr>
+          <w:p>
+            <w:pPr>
+              <w:spacing w:after="20"/>
+            </w:pPr>
+            <w:r>
+              <w:rPr>
+                <w:lang w:val="es-CO"/>
+              </w:rPr>
+              <w:t xml:space="preserve">Índices de Sobol de primer orden y de efecto total</w:t>
+            </w:r>
+          </w:p>
+        </w:tc>
+      </w:tr>
+      <w:tr>
+        <w:tc>
+          <w:tcPr>
+            <w:tcW w:w="2059" w:type="dxa"/>
+            <w:vAlign w:val="center"/>
+          </w:tcPr>
+          <w:p>
+            <w:pPr>
+              <w:spacing w:after="20"/>
+            </w:pPr>
+            <w:r>
+              <w:rPr>
+                <w:b/>
+                <w:bCs/>
+                <w:lang w:val="es-CO"/>
+              </w:rPr>
+              <w:t xml:space="preserve">ω</w:t>
+            </w:r>
+            <w:r>
+              <w:rPr>
+                <w:b/>
+                <w:bCs/>
+                <w:vertAlign w:val="subscript"/>
+                <w:lang w:val="es-CO"/>
+              </w:rPr>
+              <w:t xml:space="preserve">k</w:t>
+            </w:r>
+          </w:p>
+        </w:tc>
+        <w:tc>
+          <w:tcPr>
+            <w:tcW w:w="7300" w:type="dxa"/>
+            <w:vAlign w:val="center"/>
+          </w:tcPr>
+          <w:p>
+            <w:pPr>
+              <w:spacing w:after="20"/>
+            </w:pPr>
+            <w:r>
+              <w:rPr>
+                <w:lang w:val="es-CO"/>
+              </w:rPr>
+              <w:t xml:space="preserve">Peso normalizado y elasticidad del componente k</w:t>
+            </w:r>
+          </w:p>
+        </w:tc>
+      </w:tr>
+      <w:tr>
+        <w:tc>
+          <w:tcPr>
+            <w:tcW w:w="2059" w:type="dxa"/>
+            <w:vAlign w:val="center"/>
+          </w:tcPr>
+          <w:p>
+            <w:pPr>
+              <w:spacing w:after="20"/>
+            </w:pPr>
+            <w:r>
+              <w:rPr>
+                <w:b/>
+                <w:bCs/>
+                <w:lang w:val="es-CO"/>
+              </w:rPr>
+              <w:t xml:space="preserve">α</w:t>
+            </w:r>
+          </w:p>
+        </w:tc>
+        <w:tc>
+          <w:tcPr>
+            <w:tcW w:w="7300" w:type="dxa"/>
+            <w:vAlign w:val="center"/>
+          </w:tcPr>
+          <w:p>
+            <w:pPr>
+              <w:spacing w:after="20"/>
+            </w:pPr>
+            <w:r>
+              <w:rPr>
+                <w:lang w:val="es-CO"/>
+              </w:rPr>
+              <w:t xml:space="preserve">Exponente del ciberpoder (peso de la dependencia cibernética)</w:t>
+            </w:r>
+          </w:p>
+        </w:tc>
+      </w:tr>
+      <w:tr>
+        <w:tc>
+          <w:tcPr>
+            <w:tcW w:w="2059" w:type="dxa"/>
+            <w:vAlign w:val="center"/>
+          </w:tcPr>
+          <w:p>
+            <w:pPr>
+              <w:spacing w:after="20"/>
+            </w:pPr>
+            <w:r>
+              <w:rPr>
+                <w:b/>
+                <w:bCs/>
+                <w:lang w:val="es-CO"/>
+              </w:rPr>
+              <w:t xml:space="preserve">β</w:t>
+            </w:r>
+            <w:r>
+              <w:rPr>
+                <w:b/>
+                <w:bCs/>
+                <w:vertAlign w:val="subscript"/>
+                <w:lang w:val="es-CO"/>
+              </w:rPr>
+              <w:t xml:space="preserve">1</w:t>
+            </w:r>
+            <w:r>
+              <w:rPr>
+                <w:b/>
+                <w:bCs/>
+                <w:lang w:val="es-CO"/>
+              </w:rPr>
+              <w:t xml:space="preserve">–β</w:t>
+            </w:r>
+            <w:r>
+              <w:rPr>
+                <w:b/>
+                <w:bCs/>
+                <w:vertAlign w:val="subscript"/>
+                <w:lang w:val="es-CO"/>
+              </w:rPr>
+              <w:t xml:space="preserve">3</w:t>
+            </w:r>
+          </w:p>
+        </w:tc>
+        <w:tc>
+          <w:tcPr>
+            <w:tcW w:w="7300" w:type="dxa"/>
+            <w:vAlign w:val="center"/>
+          </w:tcPr>
+          <w:p>
+            <w:pPr>
+              <w:spacing w:after="20"/>
+            </w:pPr>
+            <w:r>
+              <w:rPr>
+                <w:lang w:val="es-CO"/>
+              </w:rPr>
+              <w:t xml:space="preserve">Pesos de CS</w:t>
+            </w:r>
+            <w:r>
+              <w:rPr>
+                <w:vertAlign w:val="subscript"/>
+                <w:lang w:val="es-CO"/>
+              </w:rPr>
+              <w:t xml:space="preserve">m</w:t>
+            </w:r>
+            <w:r>
+              <w:rPr>
+                <w:lang w:val="es-CO"/>
+              </w:rPr>
+              <w:t xml:space="preserve">, CD</w:t>
+            </w:r>
+            <w:r>
+              <w:rPr>
+                <w:vertAlign w:val="subscript"/>
+                <w:lang w:val="es-CO"/>
+              </w:rPr>
+              <w:t xml:space="preserve">m</w:t>
+            </w:r>
+            <w:r>
+              <w:rPr>
+                <w:lang w:val="es-CO"/>
+              </w:rPr>
+              <w:t xml:space="preserve"> y CR</w:t>
+            </w:r>
+            <w:r>
+              <w:rPr>
+                <w:vertAlign w:val="subscript"/>
+                <w:lang w:val="es-CO"/>
+              </w:rPr>
+              <w:t xml:space="preserve">m</w:t>
+            </w:r>
+            <w:r>
+              <w:rPr>
+                <w:lang w:val="es-CO"/>
+              </w:rPr>
+              <w:t xml:space="preserve"> en el CP</w:t>
+            </w:r>
+          </w:p>
+        </w:tc>
+      </w:tr>
+      <w:tr>
+        <w:tc>
+          <w:tcPr>
+            <w:tcW w:w="2059" w:type="dxa"/>
+            <w:vAlign w:val="center"/>
+          </w:tcPr>
+          <w:p>
+            <w:pPr>
+              <w:spacing w:after="20"/>
+            </w:pPr>
+            <w:r>
+              <w:rPr>
+                <w:b/>
+                <w:bCs/>
+                <w:lang w:val="es-CO"/>
+              </w:rPr>
               <w:t xml:space="preserve">γ</w:t>
             </w:r>
           </w:p>
@@ -21746,6 +22083,44 @@
                 <w:lang w:val="es-CO"/>
               </w:rPr>
               <w:t xml:space="preserve">Exponente de la seguridad marítima</w:t>
+            </w:r>
+          </w:p>
+        </w:tc>
+      </w:tr>
+      <w:tr>
+        <w:tc>
+          <w:tcPr>
+            <w:tcW w:w="2059" w:type="dxa"/>
+            <w:vAlign w:val="center"/>
+          </w:tcPr>
+          <w:p>
+            <w:pPr>
+              <w:spacing w:after="20"/>
+            </w:pPr>
+            <w:r>
+              <w:rPr>
+                <w:b/>
+                <w:bCs/>
+                <w:lang w:val="es-CO"/>
+              </w:rPr>
+              <w:t xml:space="preserve">δ</w:t>
+            </w:r>
+          </w:p>
+        </w:tc>
+        <w:tc>
+          <w:tcPr>
+            <w:tcW w:w="7300" w:type="dxa"/>
+            <w:vAlign w:val="center"/>
+          </w:tcPr>
+          <w:p>
+            <w:pPr>
+              <w:spacing w:after="20"/>
+            </w:pPr>
+            <w:r>
+              <w:rPr>
+                <w:lang w:val="es-CO"/>
+              </w:rPr>
+              <w:t xml:space="preserve">Coeficiente de amplificación de la ciberdiplomacia</w:t>
             </w:r>
           </w:p>
         </w:tc>

</xml_diff>